<commit_message>
fix(tools): restore Device/Serial/Inventory/Additional info/Accessories layout in handover template
The simplified 3-column table lost the template's real structure (merged
Device column spanning a per-item Serial No./Inventory No./Additional
info/Accessories block) and dropped two fields engineers actually fill in.
Rebuilt the merge-field template to match the original layout exactly,
preserving its native vertical cell merge instead of reconstructing it
(editing merged cells through python-docx's high-level API silently
corrupts the merge chain — done via raw XML instead). Also fixes the
"Generate PDF" button/string, which was stale after the docx switch.
</commit_message>
<xml_diff>
--- a/backend/app/services/templates/handover_template.docx
+++ b/backend/app/services/templates/handover_template.docx
@@ -486,7 +486,7 @@
                 <w:szCs w:val="20"/>
                 <w:lang w:val="en-US"/>
               </w:rPr>
-              <w:t>Description</w:t>
+              <w:t>Device</w:t>
             </w:r>
           </w:p>
         </w:tc>
@@ -523,7 +523,7 @@
                 <w:szCs w:val="20"/>
                 <w:lang w:val="en-US"/>
               </w:rPr>
-              <w:t>Serial No. / Inventory No.</w:t>
+              <w:t>Description</w:t>
             </w:r>
           </w:p>
         </w:tc>
@@ -569,6 +569,118 @@
         <w:tc>
           <w:tcPr>
             <w:tcW w:w="1041" w:type="pct"/>
+            <w:tcBorders>
+              <w:top w:val="single" w:sz="4" w:space="0" w:color="auto"/>
+              <w:left w:val="single" w:sz="4" w:space="0" w:color="auto"/>
+              <w:bottom w:val="single" w:sz="4" w:space="0" w:color="auto"/>
+              <w:right w:val="single" w:sz="4" w:space="0" w:color="auto"/>
+            </w:tcBorders>
+            <w:hideMark/>
+          </w:tcPr>
+          <w:p>
+            <w:pPr>
+              <w:spacing w:line="240" w:lineRule="auto"/>
+              <w:rPr>
+                <w:rFonts w:asciiTheme="majorHAnsi" w:hAnsiTheme="majorHAnsi" w:cstheme="majorHAnsi"/>
+                <w:b/>
+                <w:bCs/>
+                <w:sz w:val="20"/>
+                <w:szCs w:val="20"/>
+                <w:lang w:val="en-US"/>
+              </w:rPr>
+            </w:pPr>
+            <w:r>
+              <w:rPr>
+                <w:rFonts w:asciiTheme="majorHAnsi" w:hAnsiTheme="majorHAnsi" w:cstheme="majorHAnsi"/>
+                <w:b/>
+                <w:bCs/>
+                <w:sz w:val="20"/>
+                <w:szCs w:val="20"/>
+                <w:lang w:val="en-US"/>
+              </w:rPr>
+              <w:t xml:space="preserve">{%tr for d in devices %}</w:t>
+            </w:r>
+          </w:p>
+        </w:tc>
+        <w:tc>
+          <w:tcPr>
+            <w:tcW w:w="3481" w:type="pct"/>
+            <w:gridSpan w:val="2"/>
+            <w:tcBorders>
+              <w:top w:val="single" w:sz="4" w:space="0" w:color="auto"/>
+              <w:left w:val="single" w:sz="4" w:space="0" w:color="auto"/>
+              <w:bottom w:val="single" w:sz="4" w:space="0" w:color="auto"/>
+              <w:right w:val="single" w:sz="4" w:space="0" w:color="auto"/>
+            </w:tcBorders>
+            <w:hideMark/>
+          </w:tcPr>
+          <w:p>
+            <w:pPr>
+              <w:spacing w:line="240" w:lineRule="auto"/>
+              <w:rPr>
+                <w:rFonts w:asciiTheme="majorHAnsi" w:hAnsiTheme="majorHAnsi" w:cstheme="majorHAnsi"/>
+                <w:b/>
+                <w:bCs/>
+                <w:sz w:val="20"/>
+                <w:szCs w:val="20"/>
+                <w:lang w:val="en-US"/>
+              </w:rPr>
+            </w:pPr>
+            <w:r>
+              <w:rPr>
+                <w:rFonts w:asciiTheme="majorHAnsi" w:hAnsiTheme="majorHAnsi" w:cstheme="majorHAnsi"/>
+                <w:b/>
+                <w:bCs/>
+                <w:sz w:val="20"/>
+                <w:szCs w:val="20"/>
+                <w:lang w:val="en-US"/>
+              </w:rPr>
+              <w:t xml:space="preserve"/>
+            </w:r>
+          </w:p>
+        </w:tc>
+        <w:tc>
+          <w:tcPr>
+            <w:tcW w:w="478" w:type="pct"/>
+            <w:tcBorders>
+              <w:top w:val="single" w:sz="4" w:space="0" w:color="auto"/>
+              <w:left w:val="single" w:sz="4" w:space="0" w:color="auto"/>
+              <w:bottom w:val="single" w:sz="4" w:space="0" w:color="auto"/>
+              <w:right w:val="single" w:sz="4" w:space="0" w:color="auto"/>
+            </w:tcBorders>
+            <w:hideMark/>
+          </w:tcPr>
+          <w:p>
+            <w:pPr>
+              <w:spacing w:line="240" w:lineRule="auto"/>
+              <w:jc w:val="center"/>
+              <w:rPr>
+                <w:rFonts w:asciiTheme="majorHAnsi" w:hAnsiTheme="majorHAnsi" w:cstheme="majorHAnsi"/>
+                <w:b/>
+                <w:bCs/>
+                <w:sz w:val="20"/>
+                <w:szCs w:val="20"/>
+                <w:lang w:val="en-US"/>
+              </w:rPr>
+            </w:pPr>
+            <w:r>
+              <w:rPr>
+                <w:rFonts w:asciiTheme="majorHAnsi" w:hAnsiTheme="majorHAnsi" w:cstheme="majorHAnsi"/>
+                <w:b/>
+                <w:bCs/>
+                <w:sz w:val="20"/>
+                <w:szCs w:val="20"/>
+                <w:lang w:val="en-US"/>
+              </w:rPr>
+              <w:t xml:space="preserve"/>
+            </w:r>
+          </w:p>
+        </w:tc>
+      </w:tr>
+      <w:tr>
+        <w:tc>
+          <w:tcPr>
+            <w:tcW w:w="1041" w:type="pct"/>
             <w:vMerge w:val="restart"/>
             <w:tcBorders>
               <w:top w:val="single" w:sz="4" w:space="0" w:color="auto"/>
@@ -588,7 +700,7 @@
               </w:rPr>
             </w:pPr>
             <w:r>
-              <w:t>{%tr for d in devices %}</w:t>
+              <w:t xml:space="preserve">{{ d.description }}</w:t>
             </w:r>
           </w:p>
         </w:tc>
@@ -620,6 +732,7 @@
                 <w:szCs w:val="20"/>
                 <w:lang w:val="en-US"/>
               </w:rPr>
+              <w:t>Serial No.:</w:t>
             </w:r>
           </w:p>
         </w:tc>
@@ -643,7 +756,9 @@
                 <w:lang w:val="en-US"/>
               </w:rPr>
             </w:pPr>
-            <w:r/>
+            <w:r>
+              <w:t>{{ d.serial_no }}</w:t>
+            </w:r>
           </w:p>
         </w:tc>
         <w:tc>
@@ -666,7 +781,9 @@
                 <w:lang w:val="en-US"/>
               </w:rPr>
             </w:pPr>
-            <w:r/>
+            <w:r>
+              <w:t>{{ d.quantity }}</w:t>
+            </w:r>
           </w:p>
         </w:tc>
       </w:tr>
@@ -674,27 +791,25 @@
         <w:tc>
           <w:tcPr>
             <w:tcW w:w="1041" w:type="pct"/>
-            <w:vMerge w:val="restart"/>
+            <w:vMerge/>
             <w:tcBorders>
               <w:top w:val="single" w:sz="4" w:space="0" w:color="auto"/>
               <w:left w:val="single" w:sz="4" w:space="0" w:color="auto"/>
               <w:bottom w:val="single" w:sz="4" w:space="0" w:color="auto"/>
               <w:right w:val="single" w:sz="4" w:space="0" w:color="auto"/>
             </w:tcBorders>
-          </w:tcPr>
-          <w:p>
-            <w:pPr>
-              <w:spacing w:line="240" w:lineRule="auto"/>
-              <w:rPr>
-                <w:rFonts w:asciiTheme="majorHAnsi" w:hAnsiTheme="majorHAnsi" w:cstheme="majorHAnsi"/>
-                <w:sz w:val="20"/>
-                <w:szCs w:val="20"/>
-                <w:lang w:val="en-US"/>
-              </w:rPr>
-            </w:pPr>
-            <w:r>
-              <w:t>{{ d.description }}</w:t>
-            </w:r>
+            <w:vAlign w:val="center"/>
+            <w:hideMark/>
+          </w:tcPr>
+          <w:p>
+            <w:pPr>
+              <w:rPr>
+                <w:rFonts w:asciiTheme="majorHAnsi" w:hAnsiTheme="majorHAnsi" w:cstheme="majorHAnsi"/>
+                <w:sz w:val="20"/>
+                <w:szCs w:val="20"/>
+                <w:lang w:val="en-US"/>
+              </w:rPr>
+            </w:pPr>
           </w:p>
         </w:tc>
         <w:tc>
@@ -725,7 +840,7 @@
                 <w:szCs w:val="20"/>
                 <w:lang w:val="en-US"/>
               </w:rPr>
-              <w:t>{{ d.serial_no }} / {{ d.inventory_no }}</w:t>
+              <w:t>Inventory No.:</w:t>
             </w:r>
           </w:p>
         </w:tc>
@@ -749,6 +864,9 @@
                 <w:lang w:val="en-US"/>
               </w:rPr>
             </w:pPr>
+            <w:r>
+              <w:t>{{ d.inventory_no }}</w:t>
+            </w:r>
           </w:p>
         </w:tc>
         <w:tc>
@@ -771,9 +889,7 @@
                 <w:lang w:val="en-US"/>
               </w:rPr>
             </w:pPr>
-            <w:r>
-              <w:t>{{ d.quantity }}</w:t>
-            </w:r>
+            <w:r/>
           </w:p>
         </w:tc>
       </w:tr>
@@ -781,27 +897,25 @@
         <w:tc>
           <w:tcPr>
             <w:tcW w:w="1041" w:type="pct"/>
-            <w:vMerge w:val="restart"/>
+            <w:vMerge/>
             <w:tcBorders>
               <w:top w:val="single" w:sz="4" w:space="0" w:color="auto"/>
               <w:left w:val="single" w:sz="4" w:space="0" w:color="auto"/>
               <w:bottom w:val="single" w:sz="4" w:space="0" w:color="auto"/>
               <w:right w:val="single" w:sz="4" w:space="0" w:color="auto"/>
             </w:tcBorders>
-          </w:tcPr>
-          <w:p>
-            <w:pPr>
-              <w:spacing w:line="240" w:lineRule="auto"/>
-              <w:rPr>
-                <w:rFonts w:asciiTheme="majorHAnsi" w:hAnsiTheme="majorHAnsi" w:cstheme="majorHAnsi"/>
-                <w:sz w:val="20"/>
-                <w:szCs w:val="20"/>
-                <w:lang w:val="en-US"/>
-              </w:rPr>
-            </w:pPr>
-            <w:r>
-              <w:t>{%tr endfor %}</w:t>
-            </w:r>
+            <w:vAlign w:val="center"/>
+            <w:hideMark/>
+          </w:tcPr>
+          <w:p>
+            <w:pPr>
+              <w:rPr>
+                <w:rFonts w:asciiTheme="majorHAnsi" w:hAnsiTheme="majorHAnsi" w:cstheme="majorHAnsi"/>
+                <w:sz w:val="20"/>
+                <w:szCs w:val="20"/>
+                <w:lang w:val="en-US"/>
+              </w:rPr>
+            </w:pPr>
           </w:p>
         </w:tc>
         <w:tc>
@@ -832,6 +946,7 @@
                 <w:szCs w:val="20"/>
                 <w:lang w:val="en-US"/>
               </w:rPr>
+              <w:t>Additional info:</w:t>
             </w:r>
           </w:p>
         </w:tc>
@@ -855,7 +970,9 @@
                 <w:lang w:val="en-US"/>
               </w:rPr>
             </w:pPr>
-            <w:r/>
+            <w:r>
+              <w:t>{{ d.additional_info }}</w:t>
+            </w:r>
           </w:p>
         </w:tc>
         <w:tc>
@@ -879,6 +996,319 @@
               </w:rPr>
             </w:pPr>
             <w:r/>
+          </w:p>
+        </w:tc>
+      </w:tr>
+      <w:tr>
+        <w:tc>
+          <w:tcPr>
+            <w:tcW w:w="1041" w:type="pct"/>
+            <w:vMerge/>
+            <w:tcBorders>
+              <w:top w:val="single" w:sz="4" w:space="0" w:color="auto"/>
+              <w:left w:val="single" w:sz="4" w:space="0" w:color="auto"/>
+              <w:bottom w:val="single" w:sz="4" w:space="0" w:color="auto"/>
+              <w:right w:val="single" w:sz="4" w:space="0" w:color="auto"/>
+            </w:tcBorders>
+            <w:vAlign w:val="center"/>
+            <w:hideMark/>
+          </w:tcPr>
+          <w:p>
+            <w:pPr>
+              <w:rPr>
+                <w:rFonts w:asciiTheme="majorHAnsi" w:hAnsiTheme="majorHAnsi" w:cstheme="majorHAnsi"/>
+                <w:sz w:val="20"/>
+                <w:szCs w:val="20"/>
+                <w:lang w:val="en-US"/>
+              </w:rPr>
+            </w:pPr>
+          </w:p>
+        </w:tc>
+        <w:tc>
+          <w:tcPr>
+            <w:tcW w:w="698" w:type="pct"/>
+            <w:tcBorders>
+              <w:top w:val="single" w:sz="4" w:space="0" w:color="auto"/>
+              <w:left w:val="single" w:sz="4" w:space="0" w:color="auto"/>
+              <w:bottom w:val="single" w:sz="4" w:space="0" w:color="auto"/>
+              <w:right w:val="single" w:sz="4" w:space="0" w:color="auto"/>
+            </w:tcBorders>
+          </w:tcPr>
+          <w:p>
+            <w:pPr>
+              <w:spacing w:line="240" w:lineRule="auto"/>
+              <w:rPr>
+                <w:rFonts w:asciiTheme="majorHAnsi" w:hAnsiTheme="majorHAnsi" w:cstheme="majorHAnsi"/>
+                <w:sz w:val="20"/>
+                <w:szCs w:val="20"/>
+                <w:lang w:val="en-US"/>
+              </w:rPr>
+            </w:pPr>
+            <w:r/>
+          </w:p>
+        </w:tc>
+        <w:tc>
+          <w:tcPr>
+            <w:tcW w:w="2783" w:type="pct"/>
+            <w:tcBorders>
+              <w:top w:val="single" w:sz="4" w:space="0" w:color="auto"/>
+              <w:left w:val="single" w:sz="4" w:space="0" w:color="auto"/>
+              <w:bottom w:val="single" w:sz="4" w:space="0" w:color="auto"/>
+              <w:right w:val="single" w:sz="4" w:space="0" w:color="auto"/>
+            </w:tcBorders>
+          </w:tcPr>
+          <w:p>
+            <w:pPr>
+              <w:spacing w:line="240" w:lineRule="auto"/>
+              <w:rPr>
+                <w:rFonts w:asciiTheme="majorHAnsi" w:hAnsiTheme="majorHAnsi" w:cstheme="majorHAnsi"/>
+                <w:sz w:val="20"/>
+                <w:szCs w:val="20"/>
+                <w:lang w:val="en-US"/>
+              </w:rPr>
+            </w:pPr>
+            <w:r/>
+          </w:p>
+        </w:tc>
+        <w:tc>
+          <w:tcPr>
+            <w:tcW w:w="478" w:type="pct"/>
+            <w:tcBorders>
+              <w:top w:val="single" w:sz="4" w:space="0" w:color="auto"/>
+              <w:left w:val="single" w:sz="4" w:space="0" w:color="auto"/>
+              <w:bottom w:val="single" w:sz="4" w:space="0" w:color="auto"/>
+              <w:right w:val="single" w:sz="4" w:space="0" w:color="auto"/>
+            </w:tcBorders>
+          </w:tcPr>
+          <w:p>
+            <w:pPr>
+              <w:spacing w:line="240" w:lineRule="auto"/>
+              <w:rPr>
+                <w:rFonts w:asciiTheme="majorHAnsi" w:hAnsiTheme="majorHAnsi" w:cstheme="majorHAnsi"/>
+                <w:sz w:val="20"/>
+                <w:szCs w:val="20"/>
+                <w:lang w:val="en-US"/>
+              </w:rPr>
+            </w:pPr>
+            <w:r/>
+          </w:p>
+        </w:tc>
+      </w:tr>
+      <w:tr>
+        <w:tc>
+          <w:tcPr>
+            <w:tcW w:w="1041" w:type="pct"/>
+            <w:vMerge/>
+            <w:tcBorders>
+              <w:top w:val="single" w:sz="4" w:space="0" w:color="auto"/>
+              <w:left w:val="single" w:sz="4" w:space="0" w:color="auto"/>
+              <w:bottom w:val="single" w:sz="4" w:space="0" w:color="auto"/>
+              <w:right w:val="single" w:sz="4" w:space="0" w:color="auto"/>
+            </w:tcBorders>
+            <w:vAlign w:val="center"/>
+            <w:hideMark/>
+          </w:tcPr>
+          <w:p>
+            <w:pPr>
+              <w:rPr>
+                <w:rFonts w:asciiTheme="majorHAnsi" w:hAnsiTheme="majorHAnsi" w:cstheme="majorHAnsi"/>
+                <w:sz w:val="20"/>
+                <w:szCs w:val="20"/>
+                <w:lang w:val="en-US"/>
+              </w:rPr>
+            </w:pPr>
+          </w:p>
+        </w:tc>
+        <w:tc>
+          <w:tcPr>
+            <w:tcW w:w="698" w:type="pct"/>
+            <w:tcBorders>
+              <w:top w:val="single" w:sz="4" w:space="0" w:color="auto"/>
+              <w:left w:val="single" w:sz="4" w:space="0" w:color="auto"/>
+              <w:bottom w:val="single" w:sz="4" w:space="0" w:color="auto"/>
+              <w:right w:val="single" w:sz="4" w:space="0" w:color="auto"/>
+            </w:tcBorders>
+            <w:hideMark/>
+          </w:tcPr>
+          <w:p>
+            <w:pPr>
+              <w:spacing w:line="240" w:lineRule="auto"/>
+              <w:rPr>
+                <w:rFonts w:asciiTheme="majorHAnsi" w:hAnsiTheme="majorHAnsi" w:cstheme="majorHAnsi"/>
+                <w:sz w:val="20"/>
+                <w:szCs w:val="20"/>
+                <w:lang w:val="en-US"/>
+              </w:rPr>
+            </w:pPr>
+            <w:r>
+              <w:rPr>
+                <w:rFonts w:asciiTheme="majorHAnsi" w:hAnsiTheme="majorHAnsi" w:cstheme="majorHAnsi"/>
+                <w:sz w:val="20"/>
+                <w:szCs w:val="20"/>
+                <w:lang w:val="en-US"/>
+              </w:rPr>
+              <w:t>Accessories:</w:t>
+            </w:r>
+          </w:p>
+        </w:tc>
+        <w:tc>
+          <w:tcPr>
+            <w:tcW w:w="2783" w:type="pct"/>
+            <w:tcBorders>
+              <w:top w:val="single" w:sz="4" w:space="0" w:color="auto"/>
+              <w:left w:val="single" w:sz="4" w:space="0" w:color="auto"/>
+              <w:bottom w:val="single" w:sz="4" w:space="0" w:color="auto"/>
+              <w:right w:val="single" w:sz="4" w:space="0" w:color="auto"/>
+            </w:tcBorders>
+          </w:tcPr>
+          <w:p>
+            <w:pPr>
+              <w:spacing w:line="240" w:lineRule="auto"/>
+              <w:rPr>
+                <w:rFonts w:asciiTheme="majorHAnsi" w:hAnsiTheme="majorHAnsi" w:cstheme="majorHAnsi"/>
+                <w:sz w:val="20"/>
+                <w:szCs w:val="20"/>
+                <w:lang w:val="en-US"/>
+              </w:rPr>
+            </w:pPr>
+            <w:r>
+              <w:t>{{ d.accessories }}</w:t>
+            </w:r>
+          </w:p>
+        </w:tc>
+        <w:tc>
+          <w:tcPr>
+            <w:tcW w:w="478" w:type="pct"/>
+            <w:tcBorders>
+              <w:top w:val="single" w:sz="4" w:space="0" w:color="auto"/>
+              <w:left w:val="single" w:sz="4" w:space="0" w:color="auto"/>
+              <w:bottom w:val="single" w:sz="4" w:space="0" w:color="auto"/>
+              <w:right w:val="single" w:sz="4" w:space="0" w:color="auto"/>
+            </w:tcBorders>
+          </w:tcPr>
+          <w:p>
+            <w:pPr>
+              <w:spacing w:line="240" w:lineRule="auto"/>
+              <w:rPr>
+                <w:rFonts w:asciiTheme="majorHAnsi" w:hAnsiTheme="majorHAnsi" w:cstheme="majorHAnsi"/>
+                <w:sz w:val="20"/>
+                <w:szCs w:val="20"/>
+                <w:lang w:val="en-US"/>
+              </w:rPr>
+            </w:pPr>
+            <w:r/>
+          </w:p>
+        </w:tc>
+      </w:tr>
+      <w:tr>
+        <w:tc>
+          <w:tcPr>
+            <w:tcW w:w="1041" w:type="pct"/>
+            <w:tcBorders>
+              <w:top w:val="single" w:sz="4" w:space="0" w:color="auto"/>
+              <w:left w:val="single" w:sz="4" w:space="0" w:color="auto"/>
+              <w:bottom w:val="single" w:sz="4" w:space="0" w:color="auto"/>
+              <w:right w:val="single" w:sz="4" w:space="0" w:color="auto"/>
+            </w:tcBorders>
+            <w:hideMark/>
+          </w:tcPr>
+          <w:p>
+            <w:pPr>
+              <w:spacing w:line="240" w:lineRule="auto"/>
+              <w:rPr>
+                <w:rFonts w:asciiTheme="majorHAnsi" w:hAnsiTheme="majorHAnsi" w:cstheme="majorHAnsi"/>
+                <w:b/>
+                <w:bCs/>
+                <w:sz w:val="20"/>
+                <w:szCs w:val="20"/>
+                <w:lang w:val="en-US"/>
+              </w:rPr>
+            </w:pPr>
+            <w:r>
+              <w:rPr>
+                <w:rFonts w:asciiTheme="majorHAnsi" w:hAnsiTheme="majorHAnsi" w:cstheme="majorHAnsi"/>
+                <w:b/>
+                <w:bCs/>
+                <w:sz w:val="20"/>
+                <w:szCs w:val="20"/>
+                <w:lang w:val="en-US"/>
+              </w:rPr>
+              <w:t xml:space="preserve">{%tr endfor %}</w:t>
+            </w:r>
+          </w:p>
+        </w:tc>
+        <w:tc>
+          <w:tcPr>
+            <w:tcW w:w="3481" w:type="pct"/>
+            <w:gridSpan w:val="2"/>
+            <w:tcBorders>
+              <w:top w:val="single" w:sz="4" w:space="0" w:color="auto"/>
+              <w:left w:val="single" w:sz="4" w:space="0" w:color="auto"/>
+              <w:bottom w:val="single" w:sz="4" w:space="0" w:color="auto"/>
+              <w:right w:val="single" w:sz="4" w:space="0" w:color="auto"/>
+            </w:tcBorders>
+            <w:hideMark/>
+          </w:tcPr>
+          <w:p>
+            <w:pPr>
+              <w:spacing w:line="240" w:lineRule="auto"/>
+              <w:rPr>
+                <w:rFonts w:asciiTheme="majorHAnsi" w:hAnsiTheme="majorHAnsi" w:cstheme="majorHAnsi"/>
+                <w:b/>
+                <w:bCs/>
+                <w:sz w:val="20"/>
+                <w:szCs w:val="20"/>
+                <w:lang w:val="en-US"/>
+              </w:rPr>
+            </w:pPr>
+            <w:r>
+              <w:rPr>
+                <w:rFonts w:asciiTheme="majorHAnsi" w:hAnsiTheme="majorHAnsi" w:cstheme="majorHAnsi"/>
+                <w:b/>
+                <w:bCs/>
+                <w:sz w:val="20"/>
+                <w:szCs w:val="20"/>
+                <w:lang w:val="en-US"/>
+              </w:rPr>
+              <w:t xml:space="preserve"/>
+            </w:r>
+          </w:p>
+        </w:tc>
+        <w:tc>
+          <w:tcPr>
+            <w:tcW w:w="478" w:type="pct"/>
+            <w:tcBorders>
+              <w:top w:val="single" w:sz="4" w:space="0" w:color="auto"/>
+              <w:left w:val="single" w:sz="4" w:space="0" w:color="auto"/>
+              <w:bottom w:val="single" w:sz="4" w:space="0" w:color="auto"/>
+              <w:right w:val="single" w:sz="4" w:space="0" w:color="auto"/>
+            </w:tcBorders>
+            <w:hideMark/>
+          </w:tcPr>
+          <w:p>
+            <w:pPr>
+              <w:spacing w:line="240" w:lineRule="auto"/>
+              <w:jc w:val="center"/>
+              <w:rPr>
+                <w:rFonts w:asciiTheme="majorHAnsi" w:hAnsiTheme="majorHAnsi" w:cstheme="majorHAnsi"/>
+                <w:b/>
+                <w:bCs/>
+                <w:sz w:val="20"/>
+                <w:szCs w:val="20"/>
+                <w:lang w:val="en-US"/>
+              </w:rPr>
+            </w:pPr>
+            <w:r>
+              <w:rPr>
+                <w:rFonts w:asciiTheme="majorHAnsi" w:hAnsiTheme="majorHAnsi" w:cstheme="majorHAnsi"/>
+                <w:b/>
+                <w:bCs/>
+                <w:sz w:val="20"/>
+                <w:szCs w:val="20"/>
+                <w:lang w:val="en-US"/>
+              </w:rPr>
+              <w:t xml:space="preserve"/>
+            </w:r>
           </w:p>
         </w:tc>
       </w:tr>

</xml_diff>